<commit_message>
addition of role exclusions to clause 4.3
</commit_message>
<xml_diff>
--- a/hospital/clause 4/ISO27001_clause_4.3_ISMS_Scope_Template.docx
+++ b/hospital/clause 4/ISO27001_clause_4.3_ISMS_Scope_Template.docx
@@ -1042,6 +1042,33 @@
           <w:ilvl w:val="0"/>
           <w:numId w:val="1"/>
         </w:numPr>
+        <w:rPr>
+          <w:b/>
+          <w:bCs/>
+        </w:rPr>
+      </w:pPr>
+      <w:r>
+        <w:rPr>
+          <w:b/>
+          <w:bCs/>
+        </w:rPr>
+        <w:t xml:space="preserve">Personnel Data: </w:t>
+      </w:r>
+      <w:r>
+        <w:rPr>
+          <w:b w:val="false"/>
+          <w:bCs w:val="false"/>
+        </w:rPr>
+        <w:t>Sensitive Identifiable Information (SII), employee records</w:t>
+      </w:r>
+    </w:p>
+    <w:p>
+      <w:pPr>
+        <w:pStyle w:val="ListBullet"/>
+        <w:numPr>
+          <w:ilvl w:val="0"/>
+          <w:numId w:val="1"/>
+        </w:numPr>
         <w:rPr/>
       </w:pPr>
       <w:r>
@@ -1328,11 +1355,108 @@
         </w:tc>
       </w:tr>
       <w:tr>
+        <w:trPr>
+          <w:trHeight w:val="279" w:hRule="atLeast"/>
+        </w:trPr>
+        <w:tc>
+          <w:tcPr>
+            <w:tcW w:w="3120" w:type="dxa"/>
+            <w:tcBorders/>
+          </w:tcPr>
+          <w:p>
+            <w:pPr>
+              <w:pStyle w:val="Normal"/>
+              <w:widowControl/>
+              <w:suppressAutoHyphens w:val="true"/>
+              <w:spacing w:lineRule="auto" w:line="240" w:before="0" w:after="0"/>
+              <w:jc w:val="start"/>
+              <w:rPr>
+                <w:rFonts w:eastAsia="ＭＳ 明朝" w:cs=""/>
+                <w:kern w:val="0"/>
+                <w:szCs w:val="22"/>
+                <w:lang w:val="en-US" w:eastAsia="en-US" w:bidi="ar-SA"/>
+              </w:rPr>
+            </w:pPr>
+            <w:r>
+              <w:rPr>
+                <w:rFonts w:eastAsia="ＭＳ 明朝" w:cs=""/>
+                <w:kern w:val="0"/>
+                <w:szCs w:val="22"/>
+                <w:lang w:val="en-US" w:eastAsia="en-US" w:bidi="ar-SA"/>
+              </w:rPr>
+              <w:t>Physical Therapy</w:t>
+            </w:r>
+          </w:p>
+        </w:tc>
+        <w:tc>
+          <w:tcPr>
+            <w:tcW w:w="3120" w:type="dxa"/>
+            <w:tcBorders/>
+          </w:tcPr>
+          <w:p>
+            <w:pPr>
+              <w:pStyle w:val="Normal"/>
+              <w:widowControl/>
+              <w:suppressAutoHyphens w:val="true"/>
+              <w:spacing w:lineRule="auto" w:line="240" w:before="0" w:after="0"/>
+              <w:jc w:val="start"/>
+              <w:rPr>
+                <w:rFonts w:eastAsia="ＭＳ 明朝" w:cs=""/>
+                <w:kern w:val="0"/>
+                <w:szCs w:val="22"/>
+                <w:lang w:val="en-US" w:eastAsia="en-US" w:bidi="ar-SA"/>
+              </w:rPr>
+            </w:pPr>
+            <w:r>
+              <w:rPr>
+                <w:rFonts w:eastAsia="ＭＳ 明朝" w:cs=""/>
+                <w:kern w:val="0"/>
+                <w:szCs w:val="22"/>
+                <w:lang w:val="en-US" w:eastAsia="en-US" w:bidi="ar-SA"/>
+              </w:rPr>
+              <w:t>Use of computers required within their role however, no sensitive data is recorded just basic treatment notes with interaction of their patients</w:t>
+            </w:r>
+          </w:p>
+        </w:tc>
+        <w:tc>
+          <w:tcPr>
+            <w:tcW w:w="3120" w:type="dxa"/>
+            <w:tcBorders/>
+          </w:tcPr>
+          <w:p>
+            <w:pPr>
+              <w:pStyle w:val="Normal"/>
+              <w:widowControl/>
+              <w:suppressAutoHyphens w:val="true"/>
+              <w:spacing w:lineRule="auto" w:line="240" w:before="0" w:after="0"/>
+              <w:jc w:val="start"/>
+              <w:rPr>
+                <w:rFonts w:eastAsia="ＭＳ 明朝" w:cs=""/>
+                <w:kern w:val="0"/>
+                <w:szCs w:val="22"/>
+                <w:lang w:val="en-US" w:eastAsia="en-US" w:bidi="ar-SA"/>
+              </w:rPr>
+            </w:pPr>
+            <w:r>
+              <w:rPr>
+                <w:rFonts w:eastAsia="ＭＳ 明朝" w:cs=""/>
+                <w:kern w:val="0"/>
+                <w:szCs w:val="22"/>
+                <w:lang w:val="en-US" w:eastAsia="en-US" w:bidi="ar-SA"/>
+              </w:rPr>
+              <w:t>Majoity of time therapists adopt a hands-on interaction with patients</w:t>
+            </w:r>
+          </w:p>
+        </w:tc>
+      </w:tr>
+      <w:tr>
         <w:trPr/>
         <w:tc>
           <w:tcPr>
             <w:tcW w:w="3120" w:type="dxa"/>
-            <w:tcBorders/>
+            <w:tcBorders>
+              <w:top w:val="nil"/>
+            </w:tcBorders>
           </w:tcPr>
           <w:p>
             <w:pPr>
@@ -1362,7 +1486,9 @@
         <w:tc>
           <w:tcPr>
             <w:tcW w:w="3120" w:type="dxa"/>
-            <w:tcBorders/>
+            <w:tcBorders>
+              <w:top w:val="nil"/>
+            </w:tcBorders>
           </w:tcPr>
           <w:p>
             <w:pPr>
@@ -1392,7 +1518,9 @@
         <w:tc>
           <w:tcPr>
             <w:tcW w:w="3120" w:type="dxa"/>
-            <w:tcBorders/>
+            <w:tcBorders>
+              <w:top w:val="nil"/>
+            </w:tcBorders>
           </w:tcPr>
           <w:p>
             <w:pPr>
@@ -1416,6 +1544,106 @@
                 <w:lang w:val="en-US" w:eastAsia="en-US" w:bidi="ar-SA"/>
               </w:rPr>
               <w:t>No access to PII and SII data has been identified</w:t>
+            </w:r>
+          </w:p>
+        </w:tc>
+      </w:tr>
+      <w:tr>
+        <w:trPr>
+          <w:trHeight w:val="317" w:hRule="atLeast"/>
+        </w:trPr>
+        <w:tc>
+          <w:tcPr>
+            <w:tcW w:w="3120" w:type="dxa"/>
+            <w:tcBorders>
+              <w:top w:val="nil"/>
+            </w:tcBorders>
+          </w:tcPr>
+          <w:p>
+            <w:pPr>
+              <w:pStyle w:val="Normal"/>
+              <w:widowControl/>
+              <w:suppressAutoHyphens w:val="true"/>
+              <w:spacing w:lineRule="auto" w:line="240" w:before="0" w:after="0"/>
+              <w:jc w:val="start"/>
+              <w:rPr>
+                <w:rFonts w:eastAsia="ＭＳ 明朝" w:cs=""/>
+                <w:kern w:val="0"/>
+                <w:szCs w:val="22"/>
+                <w:lang w:val="en-US" w:eastAsia="en-US" w:bidi="ar-SA"/>
+              </w:rPr>
+            </w:pPr>
+            <w:r>
+              <w:rPr>
+                <w:rFonts w:eastAsia="ＭＳ 明朝" w:cs=""/>
+                <w:kern w:val="0"/>
+                <w:szCs w:val="22"/>
+                <w:lang w:val="en-US" w:eastAsia="en-US" w:bidi="ar-SA"/>
+              </w:rPr>
+              <w:t>Facilities and Maintenance</w:t>
+            </w:r>
+          </w:p>
+        </w:tc>
+        <w:tc>
+          <w:tcPr>
+            <w:tcW w:w="3120" w:type="dxa"/>
+            <w:tcBorders>
+              <w:top w:val="nil"/>
+            </w:tcBorders>
+          </w:tcPr>
+          <w:p>
+            <w:pPr>
+              <w:pStyle w:val="Normal"/>
+              <w:widowControl/>
+              <w:suppressAutoHyphens w:val="true"/>
+              <w:spacing w:lineRule="auto" w:line="240" w:before="0" w:after="0"/>
+              <w:jc w:val="start"/>
+              <w:rPr>
+                <w:rFonts w:eastAsia="ＭＳ 明朝" w:cs=""/>
+                <w:kern w:val="0"/>
+                <w:szCs w:val="22"/>
+                <w:lang w:val="en-US" w:eastAsia="en-US" w:bidi="ar-SA"/>
+              </w:rPr>
+            </w:pPr>
+            <w:r>
+              <w:rPr>
+                <w:rFonts w:eastAsia="ＭＳ 明朝" w:cs=""/>
+                <w:kern w:val="0"/>
+                <w:szCs w:val="22"/>
+                <w:lang w:val="en-US" w:eastAsia="en-US" w:bidi="ar-SA"/>
+              </w:rPr>
+              <w:t>No exposure to IT equipment has been identified</w:t>
+            </w:r>
+          </w:p>
+        </w:tc>
+        <w:tc>
+          <w:tcPr>
+            <w:tcW w:w="3120" w:type="dxa"/>
+            <w:tcBorders>
+              <w:top w:val="nil"/>
+            </w:tcBorders>
+          </w:tcPr>
+          <w:p>
+            <w:pPr>
+              <w:pStyle w:val="Normal"/>
+              <w:widowControl/>
+              <w:suppressAutoHyphens w:val="true"/>
+              <w:spacing w:lineRule="auto" w:line="240" w:before="0" w:after="0"/>
+              <w:jc w:val="start"/>
+              <w:rPr>
+                <w:rFonts w:eastAsia="ＭＳ 明朝" w:cs=""/>
+                <w:kern w:val="0"/>
+                <w:szCs w:val="22"/>
+                <w:lang w:val="en-US" w:eastAsia="en-US" w:bidi="ar-SA"/>
+              </w:rPr>
+            </w:pPr>
+            <w:r>
+              <w:rPr>
+                <w:rFonts w:eastAsia="ＭＳ 明朝" w:cs=""/>
+                <w:kern w:val="0"/>
+                <w:szCs w:val="22"/>
+                <w:lang w:val="en-US" w:eastAsia="en-US" w:bidi="ar-SA"/>
+              </w:rPr>
             </w:r>
           </w:p>
         </w:tc>

</xml_diff>